<commit_message>
Fill student details in Secure Code Review report
Add Aatmik Panse / 23BCS10082 / 2027 Batch / aatmik.23bcs10082@sst.scaler.com
to the Student Information table in both the Markdown and DOCX report.

Co-Authored-By: Claude Opus 4.8 (1M context) <noreply@anthropic.com>
</commit_message>
<xml_diff>
--- a/Secure_Code_Review_Assignment/Secure_Code_Review_Report.docx
+++ b/Secure_Code_Review_Assignment/Secure_Code_Review_Report.docx
@@ -100,7 +100,7 @@
                 <w:sz w:val="20"/>
                 <w:szCs w:val="20"/>
               </w:rPr>
-              <w:t xml:space="preserve"/>
+              <w:t>Aatmik Panse</w:t>
             </w:r>
           </w:p>
         </w:tc>
@@ -157,7 +157,7 @@
                 <w:sz w:val="20"/>
                 <w:szCs w:val="20"/>
               </w:rPr>
-              <w:t xml:space="preserve"/>
+              <w:t>23BCS10082</w:t>
             </w:r>
           </w:p>
         </w:tc>
@@ -214,7 +214,7 @@
                 <w:sz w:val="20"/>
                 <w:szCs w:val="20"/>
               </w:rPr>
-              <w:t xml:space="preserve"/>
+              <w:t>2027 Batch</w:t>
             </w:r>
           </w:p>
         </w:tc>
@@ -271,7 +271,7 @@
                 <w:sz w:val="20"/>
                 <w:szCs w:val="20"/>
               </w:rPr>
-              <w:t xml:space="preserve"/>
+              <w:t>aatmik.23bcs10082@sst.scaler.com</w:t>
             </w:r>
           </w:p>
         </w:tc>

</xml_diff>